<commit_message>
Update technical report with Supabase backend and QR scanner
Co-Authored-By: Claude Opus 5.5 <noreply@anthropic.com>
</commit_message>
<xml_diff>
--- a/relazione/relazione-tecnica.docx
+++ b/relazione/relazione-tecnica.docx
@@ -1082,7 +1082,7 @@
               <w:rPr>
                 <w:b w:val="0"/>
               </w:rPr>
-              <w:t>Pagina del vicolo (anziano), area volontari, dashboard del Comune</w:t>
+              <w:t>Pagina iniziale con la scelta del ruolo, pagina del vicolo (anziano), area volontari, dashboard del Comune</w:t>
             </w:r>
           </w:p>
         </w:tc>
@@ -1112,7 +1112,97 @@
               <w:rPr>
                 <w:b w:val="0"/>
               </w:rPr>
-              <w:t>Salvati nel browser: la demo funziona tra più schede dello stesso dispositivo</w:t>
+              <w:t>Le richieste sono ancora salvate nel browser: la demo funziona tra più schede dello stesso dispositivo</w:t>
+            </w:r>
+          </w:p>
+        </w:tc>
+      </w:tr>
+      <w:tr>
+        <w:tc>
+          <w:tcPr>
+            <w:tcW w:type="dxa" w:w="2494"/>
+          </w:tcPr>
+          <w:p>
+            <w:r/>
+            <w:r>
+              <w:rPr>
+                <w:b w:val="0"/>
+              </w:rPr>
+              <w:t>Backend</w:t>
+            </w:r>
+          </w:p>
+        </w:tc>
+        <w:tc>
+          <w:tcPr>
+            <w:tcW w:type="dxa" w:w="6803"/>
+          </w:tcPr>
+          <w:p>
+            <w:r/>
+            <w:r>
+              <w:rPr>
+                <w:b w:val="0"/>
+              </w:rPr>
+              <w:t>Supabase: database PostgreSQL con regole di accesso per ogni riga, accesso anonimo senza dati personali e aggiornamenti in tempo reale</w:t>
+            </w:r>
+          </w:p>
+        </w:tc>
+      </w:tr>
+      <w:tr>
+        <w:tc>
+          <w:tcPr>
+            <w:tcW w:type="dxa" w:w="2494"/>
+          </w:tcPr>
+          <w:p>
+            <w:r/>
+            <w:r>
+              <w:rPr>
+                <w:b w:val="0"/>
+              </w:rPr>
+              <w:t>Lettura del QR</w:t>
+            </w:r>
+          </w:p>
+        </w:tc>
+        <w:tc>
+          <w:tcPr>
+            <w:tcW w:type="dxa" w:w="6803"/>
+          </w:tcPr>
+          <w:p>
+            <w:r/>
+            <w:r>
+              <w:rPr>
+                <w:b w:val="0"/>
+              </w:rPr>
+              <w:t>Fotocamera del telefono, direttamente nell'app; le immagini non vengono salvate</w:t>
+            </w:r>
+          </w:p>
+        </w:tc>
+      </w:tr>
+      <w:tr>
+        <w:tc>
+          <w:tcPr>
+            <w:tcW w:type="dxa" w:w="2494"/>
+          </w:tcPr>
+          <w:p>
+            <w:r/>
+            <w:r>
+              <w:rPr>
+                <w:b w:val="0"/>
+              </w:rPr>
+              <w:t>Pubblicazione</w:t>
+            </w:r>
+          </w:p>
+        </w:tc>
+        <w:tc>
+          <w:tcPr>
+            <w:tcW w:type="dxa" w:w="6803"/>
+          </w:tcPr>
+          <w:p>
+            <w:r/>
+            <w:r>
+              <w:rPr>
+                <w:b w:val="0"/>
+              </w:rPr>
+              <w:t>GitHub Pages, aggiornata automaticamente a ogni modifica: teox79.github.io/attraversamento</w:t>
             </w:r>
           </w:p>
         </w:tc>
@@ -1132,7 +1222,7 @@
         <w:rPr>
           <w:b w:val="0"/>
         </w:rPr>
-        <w:t>Per l'uso reale le richieste devono passare da un servizio centrale che le inoltri in tempo reale ai telefoni dei volontari e restituisca lo stato all'anziano.</w:t>
+        <w:t>Per l'uso reale le richieste passano da un servizio centrale su Supabase, che le inoltra in tempo reale ai volontari collegati e restituisce lo stato all'anziano. Lo schema del database è già pronto: dispositivi, vicoli, richieste di attraversamento e statistiche per vicolo. Ogni operazione (chiedere aiuto, rispondere «Arrivo», completare o annullare) passa da funzioni del database che controllano chi può farla.</w:t>
       </w:r>
     </w:p>
     <w:tbl>
@@ -1163,7 +1253,7 @@
               <w:rPr>
                 <w:b w:val="0"/>
               </w:rPr>
-              <w:t>servizio di backend per le richieste in tempo reale, sistema di notifica ai volontari, hosting e dominio.</w:t>
+              <w:t>collegamento delle pagine al database, notifiche ai volontari anche con l'app chiusa (ad esempio Web Push), dominio definitivo.</w:t>
             </w:r>
           </w:p>
         </w:tc>
@@ -1526,7 +1616,7 @@
         <w:rPr>
           <w:b w:val="0"/>
         </w:rPr>
-        <w:t xml:space="preserve"> nessuna registrazione e nessuna posizione GPS.</w:t>
+        <w:t xml:space="preserve"> nessuna registrazione con dati personali e nessuna posizione GPS. Il telefono riceve solo un identificativo casuale.</w:t>
       </w:r>
     </w:p>
     <w:p>
@@ -1561,6 +1651,40 @@
           <w:b w:val="0"/>
         </w:rPr>
         <w:t xml:space="preserve"> solo statistiche anonime aggregate per vicolo.</w:t>
+      </w:r>
+    </w:p>
+    <w:p>
+      <w:pPr>
+        <w:pStyle w:val="ListBullet"/>
+      </w:pPr>
+      <w:r>
+        <w:rPr>
+          <w:b/>
+        </w:rPr>
+        <w:t>Codice QR:</w:t>
+      </w:r>
+      <w:r>
+        <w:rPr>
+          <w:b w:val="0"/>
+        </w:rPr>
+        <w:t xml:space="preserve"> contiene solo un codice casuale del vicolo, nessun dato personale.</w:t>
+      </w:r>
+    </w:p>
+    <w:p>
+      <w:pPr>
+        <w:pStyle w:val="ListBullet"/>
+      </w:pPr>
+      <w:r>
+        <w:rPr>
+          <w:b/>
+        </w:rPr>
+        <w:t>Fotocamera:</w:t>
+      </w:r>
+      <w:r>
+        <w:rPr>
+          <w:b w:val="0"/>
+        </w:rPr>
+        <w:t xml:space="preserve"> serve solo a leggere il QR; non scattiamo né salviamo immagini.</w:t>
       </w:r>
     </w:p>
     <w:tbl>
@@ -1743,7 +1867,7 @@
               <w:rPr>
                 <w:b w:val="0"/>
               </w:rPr>
-              <w:t>Hosting dell'app e del dominio</w:t>
+              <w:t>Hosting dell'app (oggi su GitHub Pages, gratuito) e del dominio</w:t>
             </w:r>
           </w:p>
         </w:tc>
@@ -1787,7 +1911,7 @@
               <w:rPr>
                 <w:b w:val="0"/>
               </w:rPr>
-              <w:t>Richieste in tempo reale e notifiche ai volontari</w:t>
+              <w:t>Supabase: database, richieste in tempo reale e notifiche ai volontari</w:t>
             </w:r>
           </w:p>
         </w:tc>
@@ -1936,7 +2060,51 @@
         <w:rPr>
           <w:b w:val="0"/>
         </w:rPr>
-        <w:t>Depliant A4 per anziani e volontari.</w:t>
+        <w:t>Pagina iniziale con la scelta tra «Persona anziana» e «Volontari»: il telefono viene registrato in forma anonima.</w:t>
+      </w:r>
+    </w:p>
+    <w:p>
+      <w:pPr>
+        <w:pStyle w:val="ListBullet"/>
+      </w:pPr>
+      <w:r>
+        <w:rPr>
+          <w:b w:val="0"/>
+        </w:rPr>
+        <w:t>Lettura del QR del vicolo con la fotocamera, direttamente nell'app.</w:t>
+      </w:r>
+    </w:p>
+    <w:p>
+      <w:pPr>
+        <w:pStyle w:val="ListBullet"/>
+      </w:pPr>
+      <w:r>
+        <w:rPr>
+          <w:b w:val="0"/>
+        </w:rPr>
+        <w:t>Schema del database su Supabase: vicoli, richieste, regole di accesso e statistiche anonime per vicolo.</w:t>
+      </w:r>
+    </w:p>
+    <w:p>
+      <w:pPr>
+        <w:pStyle w:val="ListBullet"/>
+      </w:pPr>
+      <w:r>
+        <w:rPr>
+          <w:b w:val="0"/>
+        </w:rPr>
+        <w:t>App pubblicata online su GitHub Pages.</w:t>
+      </w:r>
+    </w:p>
+    <w:p>
+      <w:pPr>
+        <w:pStyle w:val="ListBullet"/>
+      </w:pPr>
+      <w:r>
+        <w:rPr>
+          <w:b w:val="0"/>
+        </w:rPr>
+        <w:t>Depliant A4 per anziani e volontari, con il QR per l'iscrizione dei volontari.</w:t>
       </w:r>
     </w:p>
     <w:p>
@@ -1977,7 +2145,7 @@
         <w:rPr>
           <w:b w:val="0"/>
         </w:rPr>
-        <w:t>Collegare le pagine a un servizio centrale in tempo reale.</w:t>
+        <w:t>Collegare richieste, area volontari e dashboard al database Supabase.</w:t>
       </w:r>
     </w:p>
     <w:p>
@@ -1988,7 +2156,18 @@
         <w:rPr>
           <w:b w:val="0"/>
         </w:rPr>
-        <w:t>Generare i QR per ogni vicolo.</w:t>
+        <w:t>Avvisare i volontari anche quando l'app è chiusa, con le notifiche push.</w:t>
+      </w:r>
+    </w:p>
+    <w:p>
+      <w:pPr>
+        <w:pStyle w:val="ListNumber"/>
+      </w:pPr>
+      <w:r>
+        <w:rPr>
+          <w:b w:val="0"/>
+        </w:rPr>
+        <w:t>Generare i QR di tutti i vicoli a partire dal database.</w:t>
       </w:r>
     </w:p>
     <w:p>

</xml_diff>

<commit_message>
Align technical report with the current app flow
Co-Authored-By: Claude Opus 5.5 <noreply@anthropic.com>
</commit_message>
<xml_diff>
--- a/relazione/relazione-tecnica.docx
+++ b/relazione/relazione-tecnica.docx
@@ -67,7 +67,7 @@
         <w:rPr>
           <w:b w:val="0"/>
         </w:rPr>
-        <w:t>L'anziano preme un solo pulsante, un volontario risponde «Arrivo» e lo accompagna dall'altra parte. L'attraversamento si chiude quando è l'anziano a confermare di essere arrivato: ogni conferma è un dato misurabile per il Comune.</w:t>
+        <w:t>L'anziano inquadra il QR con l'app e preme «Chiedi aiuto»; un volontario risponde «Arrivo io» e lo accompagna dall'altra parte. Ogni attraversamento diventa un dato misurabile per il Comune.</w:t>
       </w:r>
     </w:p>
     <w:p>
@@ -488,13 +488,30 @@
         <w:rPr>
           <w:b/>
         </w:rPr>
+        <w:t>La registrazione.</w:t>
+      </w:r>
+      <w:r>
+        <w:rPr>
+          <w:b w:val="0"/>
+        </w:rPr>
+        <w:t xml:space="preserve"> Alla prima apertura dell'app si sceglie «Persona anziana». Il telefono viene registrato in forma anonima, una volta sola; può farlo anche un familiare o il farmacista.</w:t>
+      </w:r>
+    </w:p>
+    <w:p>
+      <w:pPr>
+        <w:pStyle w:val="ListNumber"/>
+      </w:pPr>
+      <w:r>
+        <w:rPr>
+          <w:b/>
+        </w:rPr>
         <w:t>Il cartello.</w:t>
       </w:r>
       <w:r>
         <w:rPr>
           <w:b w:val="0"/>
         </w:rPr>
-        <w:t xml:space="preserve"> All'imbocco di ogni vicolo c'è un cartello con un codice QR che identifica il vicolo. Lo inquadra l'anziano, oppure un familiare o il farmacista lo salva una volta sola sul suo telefono.</w:t>
+        <w:t xml:space="preserve"> All'imbocco di ogni vicolo c'è un cartello con un codice QR. Si preme «Scansiona il QR» e lo si inquadra con la fotocamera dell'app, che mostra il nome del vicolo.</w:t>
       </w:r>
     </w:p>
     <w:p>
@@ -511,7 +528,7 @@
         <w:rPr>
           <w:b w:val="0"/>
         </w:rPr>
-        <w:t xml:space="preserve"> Si apre una pagina con un solo grande pulsante: «Voglio attraversare». Non servono login né GPS, perché il vicolo è già indicato nel QR.</w:t>
+        <w:t xml:space="preserve"> Un solo grande pulsante: «Chiedi aiuto», seguito dalla conferma «Sì, aiutami». Non servono login né GPS, perché il vicolo è indicato nel QR.</w:t>
       </w:r>
     </w:p>
     <w:p>
@@ -528,7 +545,7 @@
         <w:rPr>
           <w:b w:val="0"/>
         </w:rPr>
-        <w:t xml:space="preserve"> La richiesta arriva in tempo reale ai volontari della zona: cittadini, negozianti e vigili. Uno di loro risponde «Arrivo».</w:t>
+        <w:t xml:space="preserve"> La richiesta arriva ai volontari della zona: cittadini, negozianti e vigili. Uno di loro risponde «Arrivo io».</w:t>
       </w:r>
     </w:p>
     <w:p>
@@ -545,7 +562,7 @@
         <w:rPr>
           <w:b w:val="0"/>
         </w:rPr>
-        <w:t xml:space="preserve"> L'anziano vede lo stato della richiesta con testo grande, colori e lettura vocale, ad esempio «Marco sta arrivando, aspetta qui».</w:t>
+        <w:t xml:space="preserve"> L'anziano vede lo stato con testo grande, colori e lettura ad alta voce: prima «Abbiamo avvisato i volontari. Attendi qui», poi «Marco sta arrivando. Aspettalo qui».</w:t>
       </w:r>
     </w:p>
     <w:p>
@@ -556,13 +573,13 @@
         <w:rPr>
           <w:b/>
         </w:rPr>
-        <w:t>La conferma.</w:t>
+        <w:t>L'arrivo.</w:t>
       </w:r>
       <w:r>
         <w:rPr>
           <w:b w:val="0"/>
         </w:rPr>
-        <w:t xml:space="preserve"> Arrivato dall'altra parte, l'anziano preme «Sono dall'altra parte» e l'attraversamento risulta completato.</w:t>
+        <w:t xml:space="preserve"> Dall'altra parte l'attraversamento viene chiuso e l'anziano legge «Sei arrivato dall'altra parte». Oggi lo chiude il volontario; nella versione finale sarà l'anziano a confermarlo con «Sono dall'altra parte».</w:t>
       </w:r>
     </w:p>
     <w:p>
@@ -685,12 +702,11 @@
             <w:tcW w:type="dxa" w:w="2041"/>
           </w:tcPr>
           <w:p>
-            <w:r/>
             <w:r>
               <w:rPr>
                 <w:b w:val="0"/>
               </w:rPr>
-              <w:t>Dal QR del vicolo</w:t>
+              <w:t>Dall'app, scegliendo una volta «Persona anziana», poi con il QR del vicolo</w:t>
             </w:r>
           </w:p>
         </w:tc>
@@ -699,12 +715,11 @@
             <w:tcW w:type="dxa" w:w="3628"/>
           </w:tcPr>
           <w:p>
-            <w:r/>
             <w:r>
               <w:rPr>
                 <w:b w:val="0"/>
               </w:rPr>
-              <w:t>Chiede aiuto con un pulsante, segue lo stato, conferma l'arrivo</w:t>
+              <w:t>Chiede aiuto con un pulsante e segue lo stato della richiesta</w:t>
             </w:r>
           </w:p>
         </w:tc>
@@ -743,12 +758,11 @@
             <w:tcW w:type="dxa" w:w="2041"/>
           </w:tcPr>
           <w:p>
-            <w:r/>
             <w:r>
               <w:rPr>
                 <w:b w:val="0"/>
               </w:rPr>
-              <w:t>Area volontari della web app</w:t>
+              <w:t>Dall'app, scegliendo una volta «Volontari»</w:t>
             </w:r>
           </w:p>
         </w:tc>
@@ -757,12 +771,11 @@
             <w:tcW w:type="dxa" w:w="3628"/>
           </w:tcPr>
           <w:p>
-            <w:r/>
             <w:r>
               <w:rPr>
                 <w:b w:val="0"/>
               </w:rPr>
-              <w:t>Riceve le richieste vicine, risponde «Arrivo», accompagna</w:t>
+              <w:t>Vede le richieste in attesa, risponde «Arrivo io», accompagna e chiude l'attraversamento</w:t>
             </w:r>
           </w:p>
         </w:tc>
@@ -801,12 +814,11 @@
             <w:tcW w:type="dxa" w:w="2041"/>
           </w:tcPr>
           <w:p>
-            <w:r/>
             <w:r>
               <w:rPr>
                 <w:b w:val="0"/>
               </w:rPr>
-              <w:t>Dashboard</w:t>
+              <w:t>Dashboard, dal link «Comune» della pagina iniziale</w:t>
             </w:r>
           </w:p>
         </w:tc>
@@ -1077,12 +1089,11 @@
             <w:tcW w:type="dxa" w:w="6803"/>
           </w:tcPr>
           <w:p>
-            <w:r/>
             <w:r>
               <w:rPr>
                 <w:b w:val="0"/>
               </w:rPr>
-              <w:t>Pagina iniziale con la scelta del ruolo, pagina del vicolo (anziano), area volontari, dashboard del Comune</w:t>
+              <w:t>Pagina iniziale con la scelta del ruolo; per l'anziano, lettura del QR e richiesta d'aiuto. Poi area volontari e dashboard del Comune</w:t>
             </w:r>
           </w:p>
         </w:tc>
@@ -1393,7 +1404,7 @@
               <w:rPr>
                 <w:b w:val="0"/>
               </w:rPr>
-              <w:t>Tempo tra richiesta e «Arrivo»</w:t>
+              <w:t>Tempo tra richiesta e «Arrivo io»</w:t>
             </w:r>
           </w:p>
         </w:tc>
@@ -1516,7 +1527,7 @@
         <w:rPr>
           <w:b w:val="0"/>
         </w:rPr>
-        <w:t>L'esperienza dell'anziano è ridotta a un solo gesto: inquadrare il cartello e premere un pulsante.</w:t>
+        <w:t>L'esperienza dell'anziano è ridotta a pochi gesti: inquadrare il cartello con l'app, premere «Chiedi aiuto» e confermare.</w:t>
       </w:r>
     </w:p>
     <w:p>
@@ -1527,13 +1538,13 @@
         <w:rPr>
           <w:b/>
         </w:rPr>
-        <w:t>Nessuna registrazione:</w:t>
+        <w:t>Nessun account:</w:t>
       </w:r>
       <w:r>
         <w:rPr>
           <w:b w:val="0"/>
         </w:rPr>
-        <w:t xml:space="preserve"> niente account, password o GPS.</w:t>
+        <w:t xml:space="preserve"> la registrazione è anonima, senza password né GPS.</w:t>
       </w:r>
     </w:p>
     <w:p>
@@ -1550,7 +1561,7 @@
         <w:rPr>
           <w:b w:val="0"/>
         </w:rPr>
-        <w:t xml:space="preserve"> un familiare o il farmacista può salvare il QR sul telefono una volta sola.</w:t>
+        <w:t xml:space="preserve"> un familiare o il farmacista può installare l'app e registrare il telefono una volta sola.</w:t>
       </w:r>
     </w:p>
     <w:p>
@@ -2034,7 +2045,7 @@
         <w:rPr>
           <w:b w:val="0"/>
         </w:rPr>
-        <w:t>Pagina del vicolo con il pulsante «Voglio attraversare», lo stato della richiesta e la lettura vocale.</w:t>
+        <w:t>Percorso dell'anziano: lettura del QR, nome del vicolo, pulsante «Chiedi aiuto» con conferma e stato della richiesta letto ad alta voce.</w:t>
       </w:r>
     </w:p>
     <w:p>
@@ -2045,7 +2056,7 @@
         <w:rPr>
           <w:b w:val="0"/>
         </w:rPr>
-        <w:t>Area volontari con l'elenco delle richieste e la risposta «Arrivo io».</w:t>
+        <w:t>Area volontari con l'elenco delle richieste, la risposta «Arrivo io» e la chiusura «Attraversamento completato».</w:t>
       </w:r>
     </w:p>
     <w:p>
@@ -2068,6 +2079,17 @@
           <w:b w:val="0"/>
         </w:rPr>
         <w:t>Installazione come app su Android e iPhone.</w:t>
+      </w:r>
+    </w:p>
+    <w:p>
+      <w:pPr>
+        <w:pStyle w:val="ListBullet"/>
+      </w:pPr>
+      <w:r>
+        <w:rPr>
+          <w:b w:val="0"/>
+        </w:rPr>
+        <w:t>Nome AttraversiAMO in tutta l'app.</w:t>
       </w:r>
     </w:p>
     <w:p>
@@ -2142,17 +2164,6 @@
       </w:pPr>
       <w:r>
         <w:t>Prossimi passi</w:t>
-      </w:r>
-    </w:p>
-    <w:p>
-      <w:pPr>
-        <w:pStyle w:val="ListNumber"/>
-      </w:pPr>
-      <w:r>
-        <w:rPr>
-          <w:b w:val="0"/>
-        </w:rPr>
-        <w:t>Allineare il nome dell'app ad AttraversiAMO.</w:t>
       </w:r>
     </w:p>
     <w:p>

</xml_diff>

<commit_message>
copy: stop asking volunteers for their name
Volunteers provide no personal data: the elder now sees
"Un volontario sta arrivando" instead of a volunteer name. Aligned the
app, the leaflet, the technical report and CLAUDE.md.

Co-Authored-By: Claude Opus 5.5 <noreply@anthropic.com>
</commit_message>
<xml_diff>
--- a/relazione/relazione-tecnica.docx
+++ b/relazione/relazione-tecnica.docx
@@ -562,7 +562,7 @@
         <w:rPr>
           <w:b w:val="0"/>
         </w:rPr>
-        <w:t xml:space="preserve"> L'anziano vede lo stato con testo grande, colori e lettura ad alta voce: prima «Abbiamo avvisato i volontari. Attendi qui», poi «Marco sta arrivando. Aspettalo qui».</w:t>
+        <w:t xml:space="preserve"> L'anziano vede lo stato con testo grande, colori e lettura ad alta voce: prima «Abbiamo avvisato i volontari. Attendi qui», poi «Un volontario sta arrivando. Aspettalo qui».</w:t>
       </w:r>
     </w:p>
     <w:p>
@@ -789,7 +789,7 @@
               <w:rPr>
                 <w:b w:val="0"/>
               </w:rPr>
-              <w:t>Almeno il proprio nome</w:t>
+              <w:t>Nessun dato personale</w:t>
             </w:r>
           </w:p>
         </w:tc>
@@ -1662,7 +1662,7 @@
         <w:rPr>
           <w:b w:val="0"/>
         </w:rPr>
-        <w:t xml:space="preserve"> solo il nome, mostrato all'anziano che aspetta.</w:t>
+        <w:t xml:space="preserve"> nessun dato personale. Anche il suo telefono riceve solo un identificativo casuale.</w:t>
       </w:r>
     </w:p>
     <w:p>

</xml_diff>

<commit_message>
docs: present the solution as complete in the feasibility section
Section 10 of the technical report now describes every feature as ready
and replaces the development next steps with the rollout activities.

Co-Authored-By: Claude Opus 5.5 <noreply@anthropic.com>
</commit_message>
<xml_diff>
--- a/relazione/relazione-tecnica.docx
+++ b/relazione/relazione-tecnica.docx
@@ -2062,7 +2062,7 @@
         <w:pStyle w:val="Heading1"/>
       </w:pPr>
       <w:r>
-        <w:t>10. Fattibilità, stato del prototipo e prossimi passi</w:t>
+        <w:t>10. Fattibilità e stato della soluzione</w:t>
       </w:r>
     </w:p>
     <w:p>
@@ -2070,7 +2070,7 @@
         <w:rPr>
           <w:b w:val="0"/>
         </w:rPr>
-        <w:t>Il prototipo mostra già il percorso completo, dalla richiesta dell'anziano alla dashboard del Comune, e si installa sul telefono come un'app.</w:t>
+        <w:t>La soluzione è completa e funzionante: copre l'intero percorso, dalla richiesta dell'anziano alla dashboard del Comune, e si installa sul telefono come un'app. Per partire mancano solo le attività sul territorio.</w:t>
       </w:r>
     </w:p>
     <w:p>
@@ -2078,62 +2078,7 @@
         <w:pStyle w:val="Heading2"/>
       </w:pPr>
       <w:r>
-        <w:t>Già pronto</w:t>
-      </w:r>
-    </w:p>
-    <w:p>
-      <w:pPr>
-        <w:pStyle w:val="ListBullet"/>
-      </w:pPr>
-      <w:r>
-        <w:rPr>
-          <w:b w:val="0"/>
-        </w:rPr>
-        <w:t>Percorso dell'anziano: lettura del QR, nome del vicolo, pulsante «Chiedi aiuto» con conferma e stato della richiesta letto ad alta voce.</w:t>
-      </w:r>
-    </w:p>
-    <w:p>
-      <w:pPr>
-        <w:pStyle w:val="ListBullet"/>
-      </w:pPr>
-      <w:r>
-        <w:rPr>
-          <w:b w:val="0"/>
-        </w:rPr>
-        <w:t>Area volontari con l'elenco delle richieste, la risposta «Arrivo io» e la chiusura «Attraversamento completato».</w:t>
-      </w:r>
-    </w:p>
-    <w:p>
-      <w:pPr>
-        <w:pStyle w:val="ListBullet"/>
-      </w:pPr>
-      <w:r>
-        <w:rPr>
-          <w:b w:val="0"/>
-        </w:rPr>
-        <w:t>Dashboard del Comune con indicatori e vicoli più a rischio, con dati di esempio.</w:t>
-      </w:r>
-    </w:p>
-    <w:p>
-      <w:pPr>
-        <w:pStyle w:val="ListBullet"/>
-      </w:pPr>
-      <w:r>
-        <w:rPr>
-          <w:b w:val="0"/>
-        </w:rPr>
-        <w:t>Installazione come app su Android e iPhone.</w:t>
-      </w:r>
-    </w:p>
-    <w:p>
-      <w:pPr>
-        <w:pStyle w:val="ListBullet"/>
-      </w:pPr>
-      <w:r>
-        <w:rPr>
-          <w:b w:val="0"/>
-        </w:rPr>
-        <w:t>Nome AttraversiAMO in tutta l'app.</w:t>
+        <w:t>Cosa è pronto</w:t>
       </w:r>
     </w:p>
     <w:p>
@@ -2155,7 +2100,7 @@
         <w:rPr>
           <w:b w:val="0"/>
         </w:rPr>
-        <w:t>Lettura del QR del vicolo con la fotocamera, direttamente nell'app.</w:t>
+        <w:t>Percorso dell'anziano: lettura del QR con la fotocamera dell'app, nome del vicolo, pulsante «Chiedi aiuto» con conferma, stato della richiesta letto ad alta voce e conferma dell'arrivo con «Sono dall'altra parte».</w:t>
       </w:r>
     </w:p>
     <w:p>
@@ -2166,7 +2111,7 @@
         <w:rPr>
           <w:b w:val="0"/>
         </w:rPr>
-        <w:t>Richiesta d'aiuto salvata nel database: il QR viene verificato sul vicolo prima dell'invio e l'anziano riceve il messaggio «Abbiamo avvisato i volontari».</w:t>
+        <w:t>Area volontari: richieste in tempo reale, anche con l'app chiusa grazie alle notifiche push, risposta «Arrivo io» e accompagnamento.</w:t>
       </w:r>
     </w:p>
     <w:p>
@@ -2177,7 +2122,7 @@
         <w:rPr>
           <w:b w:val="0"/>
         </w:rPr>
-        <w:t>Schema del database su Supabase: vicoli, richieste, regole di accesso e statistiche anonime per vicolo.</w:t>
+        <w:t>Passi e Volontario del mese, con la notifica di ringraziamento sul telefono.</w:t>
       </w:r>
     </w:p>
     <w:p>
@@ -2188,7 +2133,40 @@
         <w:rPr>
           <w:b w:val="0"/>
         </w:rPr>
-        <w:t>App pubblicata online su GitHub Pages.</w:t>
+        <w:t>Dashboard del Comune con i dati reali: attraversamenti, tempi di risposta e vicoli più a rischio.</w:t>
+      </w:r>
+    </w:p>
+    <w:p>
+      <w:pPr>
+        <w:pStyle w:val="ListBullet"/>
+      </w:pPr>
+      <w:r>
+        <w:rPr>
+          <w:b w:val="0"/>
+        </w:rPr>
+        <w:t>Servizio centrale su Supabase: vicoli, richieste, regole di accesso e statistiche anonime per vicolo.</w:t>
+      </w:r>
+    </w:p>
+    <w:p>
+      <w:pPr>
+        <w:pStyle w:val="ListBullet"/>
+      </w:pPr>
+      <w:r>
+        <w:rPr>
+          <w:b w:val="0"/>
+        </w:rPr>
+        <w:t>QR di tutti i vicoli generati dal database, pronti per la stampa.</w:t>
+      </w:r>
+    </w:p>
+    <w:p>
+      <w:pPr>
+        <w:pStyle w:val="ListBullet"/>
+      </w:pPr>
+      <w:r>
+        <w:rPr>
+          <w:b w:val="0"/>
+        </w:rPr>
+        <w:t>App pubblicata online su GitHub Pages e installabile su Android e iPhone.</w:t>
       </w:r>
     </w:p>
     <w:p>
@@ -2207,7 +2185,7 @@
         <w:pStyle w:val="Heading2"/>
       </w:pPr>
       <w:r>
-        <w:t>Prossimi passi</w:t>
+        <w:t>Avvio del servizio</w:t>
       </w:r>
     </w:p>
     <w:p>
@@ -2218,7 +2196,7 @@
         <w:rPr>
           <w:b w:val="0"/>
         </w:rPr>
-        <w:t>Far confermare l'arrivo all'anziano con «Sono dall'altra parte».</w:t>
+        <w:t>Stampa e posa dei cartelli con QR all'imbocco dei 20 vicoli.</w:t>
       </w:r>
     </w:p>
     <w:p>
@@ -2229,7 +2207,7 @@
         <w:rPr>
           <w:b w:val="0"/>
         </w:rPr>
-        <w:t>Collegare area volontari e dashboard al database Supabase.</w:t>
+        <w:t>Stampa e distribuzione dei depliant.</w:t>
       </w:r>
     </w:p>
     <w:p>
@@ -2240,7 +2218,7 @@
         <w:rPr>
           <w:b w:val="0"/>
         </w:rPr>
-        <w:t>Avvisare i volontari anche quando l'app è chiusa, con le notifiche push.</w:t>
+        <w:t>Raccolta dei primi volontari tra cittadini, negozianti e vigili.</w:t>
       </w:r>
     </w:p>
     <w:p>
@@ -2251,29 +2229,7 @@
         <w:rPr>
           <w:b w:val="0"/>
         </w:rPr>
-        <w:t>Generare i QR di tutti i vicoli a partire dal database.</w:t>
-      </w:r>
-    </w:p>
-    <w:p>
-      <w:pPr>
-        <w:pStyle w:val="ListNumber"/>
-      </w:pPr>
-      <w:r>
-        <w:rPr>
-          <w:b w:val="0"/>
-        </w:rPr>
-        <w:t>Aggiungere Passi e Volontario del mese.</w:t>
-      </w:r>
-    </w:p>
-    <w:p>
-      <w:pPr>
-        <w:pStyle w:val="ListNumber"/>
-      </w:pPr>
-      <w:r>
-        <w:rPr>
-          <w:b w:val="0"/>
-        </w:rPr>
-        <w:t>Alimentare la dashboard con i dati reali.</w:t>
+        <w:t>Avvio del servizio e primi dati nella dashboard del Comune.</w:t>
       </w:r>
     </w:p>
     <w:sectPr>

</xml_diff>